<commit_message>
docs: add founder, co-maintainer, and TrustBridge reviewer contacts
Record Divya Sornaraja and Prajna Prayas in TEAM.md and knowledge transfer
guide; note TrustBridge as pending official domain-review partnership.

Co-authored-by: Cursor <cursoragent@cursor.com>
</commit_message>
<xml_diff>
--- a/jem/docs/JEM_Knowledge_Transfer.docx
+++ b/jem/docs/JEM_Knowledge_Transfer.docx
@@ -2,7 +2,7 @@
 <file path=word/document.xml><?xml version="1.0" encoding="utf-8"?>
 <w:document xmlns:w="http://schemas.openxmlformats.org/wordprocessingml/2006/main" xmlns:m="http://schemas.openxmlformats.org/officeDocument/2006/math" xmlns:r="http://schemas.openxmlformats.org/officeDocument/2006/relationships" xmlns:o="urn:schemas-microsoft-com:office:office" xmlns:v="urn:schemas-microsoft-com:vml" xmlns:w10="urn:schemas-microsoft-com:office:word" xmlns:a="http://schemas.openxmlformats.org/drawingml/2006/main" xmlns:pic="http://schemas.openxmlformats.org/drawingml/2006/picture" xmlns:wp="http://schemas.openxmlformats.org/drawingml/2006/wordprocessingDrawing">
   <w:body>
-    <w:bookmarkStart w:id="52" w:name="jem-knowledge-transfer-guide"/>
+    <w:bookmarkStart w:id="54" w:name="jem-knowledge-transfer-guide"/>
     <w:p>
       <w:pPr>
         <w:pStyle w:val="Heading1"/>
@@ -160,7 +160,18 @@
               <w:pStyle w:val="Compact"/>
             </w:pPr>
             <w:r>
-              <w:t xml:space="preserve">Project founder (data, deploy, process design)</w:t>
+              <w:t xml:space="preserve">Divya Sornaraja (</w:t>
+            </w:r>
+            <w:hyperlink r:id="rId9">
+              <w:r>
+                <w:rPr>
+                  <w:rStyle w:val="Hyperlink"/>
+                </w:rPr>
+                <w:t xml:space="preserve">@dso6060</w:t>
+              </w:r>
+            </w:hyperlink>
+            <w:r>
+              <w:t xml:space="preserve">) — data, deploy, process design</w:t>
             </w:r>
           </w:p>
         </w:tc>
@@ -177,18 +188,18 @@
                 <w:b/>
                 <w:bCs/>
               </w:rPr>
-              <w:t xml:space="preserve">Co-maintainer role</w:t>
-            </w:r>
-          </w:p>
-        </w:tc>
-        <w:tc>
-          <w:tcPr/>
-          <w:p>
-            <w:pPr>
-              <w:pStyle w:val="Compact"/>
-            </w:pPr>
-            <w:r>
-              <w:t xml:space="preserve">Equal co-maintainer on GitHub; friedso.com deploy stays with founder</w:t>
+              <w:t xml:space="preserve">Co-maintainer</w:t>
+            </w:r>
+          </w:p>
+        </w:tc>
+        <w:tc>
+          <w:tcPr/>
+          <w:p>
+            <w:pPr>
+              <w:pStyle w:val="Compact"/>
+            </w:pPr>
+            <w:r>
+              <w:t xml:space="preserve">Prajna Prayas — equal on GitHub; friedso.com deploy stays with founder</w:t>
             </w:r>
           </w:p>
         </w:tc>
@@ -295,7 +306,7 @@
         </w:pict>
       </w:r>
     </w:p>
-    <w:bookmarkStart w:id="13" w:name="purpose-of-this-document"/>
+    <w:bookmarkStart w:id="14" w:name="purpose-of-this-document"/>
     <w:p>
       <w:pPr>
         <w:pStyle w:val="Heading2"/>
@@ -344,7 +355,7 @@
           <w:numId w:val="1001"/>
         </w:numPr>
       </w:pPr>
-      <w:hyperlink r:id="rId9">
+      <w:hyperlink r:id="rId10">
         <w:r>
           <w:rPr>
             <w:rStyle w:val="VerbatimChar"/>
@@ -367,7 +378,7 @@
           <w:numId w:val="1001"/>
         </w:numPr>
       </w:pPr>
-      <w:hyperlink r:id="rId10">
+      <w:hyperlink r:id="rId11">
         <w:r>
           <w:rPr>
             <w:rStyle w:val="VerbatimChar"/>
@@ -390,7 +401,7 @@
           <w:numId w:val="1001"/>
         </w:numPr>
       </w:pPr>
-      <w:hyperlink r:id="rId11">
+      <w:hyperlink r:id="rId12">
         <w:r>
           <w:rPr>
             <w:rStyle w:val="VerbatimChar"/>
@@ -413,7 +424,7 @@
           <w:numId w:val="1001"/>
         </w:numPr>
       </w:pPr>
-      <w:hyperlink r:id="rId12">
+      <w:hyperlink r:id="rId13">
         <w:r>
           <w:rPr>
             <w:rStyle w:val="VerbatimChar"/>
@@ -435,8 +446,8 @@
         </w:pict>
       </w:r>
     </w:p>
-    <w:bookmarkEnd w:id="13"/>
-    <w:bookmarkStart w:id="14" w:name="executive-summary"/>
+    <w:bookmarkEnd w:id="14"/>
+    <w:bookmarkStart w:id="15" w:name="executive-summary"/>
     <w:p>
       <w:pPr>
         <w:pStyle w:val="Heading2"/>
@@ -965,8 +976,8 @@
         </w:pict>
       </w:r>
     </w:p>
-    <w:bookmarkEnd w:id="14"/>
-    <w:bookmarkStart w:id="17" w:name="what-jem-is-and-is-not"/>
+    <w:bookmarkEnd w:id="15"/>
+    <w:bookmarkStart w:id="18" w:name="what-jem-is-and-is-not"/>
     <w:p>
       <w:pPr>
         <w:pStyle w:val="Heading2"/>
@@ -975,7 +986,7 @@
         <w:t xml:space="preserve">3. What JEM is — and is not</w:t>
       </w:r>
     </w:p>
-    <w:bookmarkStart w:id="15" w:name="in-scope"/>
+    <w:bookmarkStart w:id="16" w:name="in-scope"/>
     <w:p>
       <w:pPr>
         <w:pStyle w:val="Heading3"/>
@@ -1098,8 +1109,8 @@
         <w:t xml:space="preserve">Interactive map: semantic zoom L0–L3, timeline scroller, relationship lenses</w:t>
       </w:r>
     </w:p>
-    <w:bookmarkEnd w:id="15"/>
-    <w:bookmarkStart w:id="16" w:name="out-of-scope-by-design"/>
+    <w:bookmarkEnd w:id="16"/>
+    <w:bookmarkStart w:id="17" w:name="out-of-scope-by-design"/>
     <w:p>
       <w:pPr>
         <w:pStyle w:val="Heading3"/>
@@ -1163,9 +1174,9 @@
         </w:pict>
       </w:r>
     </w:p>
-    <w:bookmarkEnd w:id="16"/>
     <w:bookmarkEnd w:id="17"/>
-    <w:bookmarkStart w:id="21" w:name="system-architecture"/>
+    <w:bookmarkEnd w:id="18"/>
+    <w:bookmarkStart w:id="22" w:name="system-architecture"/>
     <w:p>
       <w:pPr>
         <w:pStyle w:val="Heading2"/>
@@ -1174,7 +1185,7 @@
         <w:t xml:space="preserve">4. System architecture</w:t>
       </w:r>
     </w:p>
-    <w:bookmarkStart w:id="18" w:name="data-flow"/>
+    <w:bookmarkStart w:id="19" w:name="data-flow"/>
     <w:p>
       <w:pPr>
         <w:pStyle w:val="Heading3"/>
@@ -1392,8 +1403,8 @@
         <w:t xml:space="preserve">                    Static host (e.g. friedso.com/apps/jem/)</w:t>
       </w:r>
     </w:p>
-    <w:bookmarkEnd w:id="18"/>
-    <w:bookmarkStart w:id="19" w:name="repository-layout"/>
+    <w:bookmarkEnd w:id="19"/>
+    <w:bookmarkStart w:id="20" w:name="repository-layout"/>
     <w:p>
       <w:pPr>
         <w:pStyle w:val="Heading3"/>
@@ -1494,8 +1505,8 @@
         <w:t xml:space="preserve">    └── docs/                 This file + runbooks</w:t>
       </w:r>
     </w:p>
-    <w:bookmarkEnd w:id="19"/>
-    <w:bookmarkStart w:id="20" w:name="visualisation-levels"/>
+    <w:bookmarkEnd w:id="20"/>
+    <w:bookmarkStart w:id="21" w:name="visualisation-levels"/>
     <w:p>
       <w:pPr>
         <w:pStyle w:val="Heading3"/>
@@ -1731,9 +1742,9 @@
         </w:pict>
       </w:r>
     </w:p>
-    <w:bookmarkEnd w:id="20"/>
     <w:bookmarkEnd w:id="21"/>
-    <w:bookmarkStart w:id="22" w:name="how-data-was-collected"/>
+    <w:bookmarkEnd w:id="22"/>
+    <w:bookmarkStart w:id="23" w:name="how-data-was-collected"/>
     <w:p>
       <w:pPr>
         <w:pStyle w:val="Heading2"/>
@@ -2034,8 +2045,8 @@
         </w:pict>
       </w:r>
     </w:p>
-    <w:bookmarkEnd w:id="22"/>
-    <w:bookmarkStart w:id="23" w:name="X4961a5d4f29697ac7b59e9e7819f0310b8c4d87"/>
+    <w:bookmarkEnd w:id="23"/>
+    <w:bookmarkStart w:id="24" w:name="X4961a5d4f29697ac7b59e9e7819f0310b8c4d87"/>
     <w:p>
       <w:pPr>
         <w:pStyle w:val="Heading2"/>
@@ -2516,8 +2527,8 @@
         </w:pict>
       </w:r>
     </w:p>
-    <w:bookmarkEnd w:id="23"/>
-    <w:bookmarkStart w:id="28" w:name="X1cd53ff16e474358d226c647670c9f57ec6d59c"/>
+    <w:bookmarkEnd w:id="24"/>
+    <w:bookmarkStart w:id="29" w:name="X1cd53ff16e474358d226c647670c9f57ec6d59c"/>
     <w:p>
       <w:pPr>
         <w:pStyle w:val="Heading2"/>
@@ -2526,7 +2537,7 @@
         <w:t xml:space="preserve">7. Validation — automated, maintainer, and community</w:t>
       </w:r>
     </w:p>
-    <w:bookmarkStart w:id="24" w:name="Xca92fe06f7e9fe51691c55b450e9640e79523f3"/>
+    <w:bookmarkStart w:id="25" w:name="Xca92fe06f7e9fe51691c55b450e9640e79523f3"/>
     <w:p>
       <w:pPr>
         <w:pStyle w:val="Heading3"/>
@@ -2694,8 +2705,8 @@
         <w:t xml:space="preserve">or deploy.</w:t>
       </w:r>
     </w:p>
-    <w:bookmarkEnd w:id="24"/>
-    <w:bookmarkStart w:id="25" w:name="X785fca212d826470408ed91c50e1f51e854bba6"/>
+    <w:bookmarkEnd w:id="25"/>
+    <w:bookmarkStart w:id="26" w:name="X785fca212d826470408ed91c50e1f51e854bba6"/>
     <w:p>
       <w:pPr>
         <w:pStyle w:val="Heading3"/>
@@ -2805,8 +2816,8 @@
         <w:t xml:space="preserve">only after verified data + score breakdown review</w:t>
       </w:r>
     </w:p>
-    <w:bookmarkEnd w:id="25"/>
-    <w:bookmarkStart w:id="26" w:name="Xde7abcf300f65d4b6585237f77eb57c5f78c8ec"/>
+    <w:bookmarkEnd w:id="26"/>
+    <w:bookmarkStart w:id="27" w:name="Xde7abcf300f65d4b6585237f77eb57c5f78c8ec"/>
     <w:p>
       <w:pPr>
         <w:pStyle w:val="Heading3"/>
@@ -3411,8 +3422,8 @@
         <w:t xml:space="preserve">flag if unresolved)</w:t>
       </w:r>
     </w:p>
-    <w:bookmarkEnd w:id="26"/>
-    <w:bookmarkStart w:id="27" w:name="known-technical-debt-acceptable-for-v0.9"/>
+    <w:bookmarkEnd w:id="27"/>
+    <w:bookmarkStart w:id="28" w:name="known-technical-debt-acceptable-for-v0.9"/>
     <w:p>
       <w:pPr>
         <w:pStyle w:val="Heading3"/>
@@ -3544,9 +3555,9 @@
         </w:pict>
       </w:r>
     </w:p>
-    <w:bookmarkEnd w:id="27"/>
     <w:bookmarkEnd w:id="28"/>
-    <w:bookmarkStart w:id="29" w:name="contribution-model-agreed-direction"/>
+    <w:bookmarkEnd w:id="29"/>
+    <w:bookmarkStart w:id="30" w:name="contribution-model-agreed-direction"/>
     <w:p>
       <w:pPr>
         <w:pStyle w:val="Heading2"/>
@@ -3742,8 +3753,8 @@
         </w:pict>
       </w:r>
     </w:p>
-    <w:bookmarkEnd w:id="29"/>
-    <w:bookmarkStart w:id="38" w:name="github-community-launch-plan"/>
+    <w:bookmarkEnd w:id="30"/>
+    <w:bookmarkStart w:id="39" w:name="github-community-launch-plan"/>
     <w:p>
       <w:pPr>
         <w:pStyle w:val="Heading2"/>
@@ -3767,6 +3778,12 @@
         <w:t xml:space="preserve"> </w:t>
       </w:r>
       <w:r>
+        <w:t xml:space="preserve">Divya Sornaraja ·</w:t>
+      </w:r>
+      <w:r>
+        <w:t xml:space="preserve"> </w:t>
+      </w:r>
+      <w:r>
         <w:rPr>
           <w:rStyle w:val="VerbatimChar"/>
         </w:rPr>
@@ -3792,7 +3809,7 @@
         <w:t xml:space="preserve"> </w:t>
       </w:r>
       <w:r>
-        <w:t xml:space="preserve">add to</w:t>
+        <w:t xml:space="preserve">Prajna Prayas (add GitHub username to</w:t>
       </w:r>
       <w:r>
         <w:t xml:space="preserve"> </w:t>
@@ -3807,7 +3824,7 @@
         <w:t xml:space="preserve"> </w:t>
       </w:r>
       <w:r>
-        <w:t xml:space="preserve">when username known.</w:t>
+        <w:t xml:space="preserve">when known).</w:t>
       </w:r>
     </w:p>
     <w:p>
@@ -3880,7 +3897,7 @@
             <w:pPr>
               <w:pStyle w:val="Compact"/>
             </w:pPr>
-            <w:hyperlink r:id="rId30">
+            <w:hyperlink r:id="rId31">
               <w:r>
                 <w:rPr>
                   <w:rStyle w:val="VerbatimChar"/>
@@ -3930,7 +3947,7 @@
             <w:pPr>
               <w:pStyle w:val="Compact"/>
             </w:pPr>
-            <w:hyperlink r:id="rId31">
+            <w:hyperlink r:id="rId32">
               <w:r>
                 <w:rPr>
                   <w:rStyle w:val="VerbatimChar"/>
@@ -3959,7 +3976,7 @@
             <w:pPr>
               <w:pStyle w:val="Compact"/>
             </w:pPr>
-            <w:hyperlink r:id="rId32">
+            <w:hyperlink r:id="rId33">
               <w:r>
                 <w:rPr>
                   <w:rStyle w:val="VerbatimChar"/>
@@ -4000,7 +4017,7 @@
             <w:pPr>
               <w:pStyle w:val="Compact"/>
             </w:pPr>
-            <w:hyperlink r:id="rId33">
+            <w:hyperlink r:id="rId34">
               <w:r>
                 <w:rPr>
                   <w:rStyle w:val="VerbatimChar"/>
@@ -4029,7 +4046,7 @@
             <w:pPr>
               <w:pStyle w:val="Compact"/>
             </w:pPr>
-            <w:hyperlink r:id="rId34">
+            <w:hyperlink r:id="rId35">
               <w:r>
                 <w:rPr>
                   <w:rStyle w:val="VerbatimChar"/>
@@ -4109,7 +4126,7 @@
             <w:pPr>
               <w:pStyle w:val="Compact"/>
             </w:pPr>
-            <w:hyperlink r:id="rId35">
+            <w:hyperlink r:id="rId36">
               <w:r>
                 <w:rPr>
                   <w:rStyle w:val="VerbatimChar"/>
@@ -4153,7 +4170,7 @@
             <w:pPr>
               <w:pStyle w:val="Compact"/>
             </w:pPr>
-            <w:hyperlink r:id="rId36">
+            <w:hyperlink r:id="rId37">
               <w:r>
                 <w:rPr>
                   <w:rStyle w:val="VerbatimChar"/>
@@ -4182,7 +4199,7 @@
             <w:pPr>
               <w:pStyle w:val="Compact"/>
             </w:pPr>
-            <w:hyperlink r:id="rId37">
+            <w:hyperlink r:id="rId38">
               <w:r>
                 <w:rPr>
                   <w:rStyle w:val="VerbatimChar"/>
@@ -4281,8 +4298,8 @@
         </w:pict>
       </w:r>
     </w:p>
-    <w:bookmarkEnd w:id="38"/>
-    <w:bookmarkStart w:id="40" w:name="deployment-founder-operated"/>
+    <w:bookmarkEnd w:id="39"/>
+    <w:bookmarkStart w:id="41" w:name="deployment-founder-operated"/>
     <w:p>
       <w:pPr>
         <w:pStyle w:val="Heading2"/>
@@ -4323,7 +4340,7 @@
       <w:r>
         <w:t xml:space="preserve"> </w:t>
       </w:r>
-      <w:hyperlink r:id="rId39">
+      <w:hyperlink r:id="rId40">
         <w:r>
           <w:rPr>
             <w:rStyle w:val="VerbatimChar"/>
@@ -4507,8 +4524,8 @@
         </w:pict>
       </w:r>
     </w:p>
-    <w:bookmarkEnd w:id="40"/>
-    <w:bookmarkStart w:id="41" w:name="versioning-note-v0.9-vs-build-metadata"/>
+    <w:bookmarkEnd w:id="41"/>
+    <w:bookmarkStart w:id="42" w:name="versioning-note-v0.9-vs-build-metadata"/>
     <w:p>
       <w:pPr>
         <w:pStyle w:val="Heading2"/>
@@ -4707,8 +4724,8 @@
         </w:pict>
       </w:r>
     </w:p>
-    <w:bookmarkEnd w:id="41"/>
-    <w:bookmarkStart w:id="42" w:name="roadmap-summary"/>
+    <w:bookmarkEnd w:id="42"/>
+    <w:bookmarkStart w:id="43" w:name="roadmap-summary"/>
     <w:p>
       <w:pPr>
         <w:pStyle w:val="Heading2"/>
@@ -5077,8 +5094,8 @@
         </w:pict>
       </w:r>
     </w:p>
-    <w:bookmarkEnd w:id="42"/>
-    <w:bookmarkStart w:id="43" w:name="success-metrics-targets"/>
+    <w:bookmarkEnd w:id="43"/>
+    <w:bookmarkStart w:id="44" w:name="success-metrics-targets"/>
     <w:p>
       <w:pPr>
         <w:pStyle w:val="Heading2"/>
@@ -5286,8 +5303,8 @@
         </w:pict>
       </w:r>
     </w:p>
-    <w:bookmarkEnd w:id="43"/>
-    <w:bookmarkStart w:id="44" w:name="known-gaps-access-control"/>
+    <w:bookmarkEnd w:id="44"/>
+    <w:bookmarkStart w:id="45" w:name="known-gaps-access-control"/>
     <w:p>
       <w:pPr>
         <w:pStyle w:val="Heading2"/>
@@ -5534,8 +5551,8 @@
         </w:pict>
       </w:r>
     </w:p>
-    <w:bookmarkEnd w:id="44"/>
-    <w:bookmarkStart w:id="45" w:name="suggested-legal-disclaimer-readme-site"/>
+    <w:bookmarkEnd w:id="45"/>
+    <w:bookmarkStart w:id="46" w:name="suggested-legal-disclaimer-readme-site"/>
     <w:p>
       <w:pPr>
         <w:pStyle w:val="Heading2"/>
@@ -5582,8 +5599,8 @@
         </w:pict>
       </w:r>
     </w:p>
-    <w:bookmarkEnd w:id="45"/>
-    <w:bookmarkStart w:id="47" w:name="licences-attribution"/>
+    <w:bookmarkEnd w:id="46"/>
+    <w:bookmarkStart w:id="48" w:name="licences-attribution"/>
     <w:p>
       <w:pPr>
         <w:pStyle w:val="Heading2"/>
@@ -5766,7 +5783,7 @@
         </w:rPr>
         <w:t xml:space="preserve"> </w:t>
       </w:r>
-      <w:hyperlink r:id="rId46">
+      <w:hyperlink r:id="rId47">
         <w:r>
           <w:rPr>
             <w:rStyle w:val="Hyperlink"/>
@@ -5814,8 +5831,8 @@
         </w:pict>
       </w:r>
     </w:p>
-    <w:bookmarkEnd w:id="47"/>
-    <w:bookmarkStart w:id="48" w:name="co-maintainer-handoff-checklist"/>
+    <w:bookmarkEnd w:id="48"/>
+    <w:bookmarkStart w:id="49" w:name="co-maintainer-handoff-checklist"/>
     <w:p>
       <w:pPr>
         <w:pStyle w:val="Heading2"/>
@@ -6044,8 +6061,8 @@
         </w:pict>
       </w:r>
     </w:p>
-    <w:bookmarkEnd w:id="48"/>
-    <w:bookmarkStart w:id="49" w:name="essential-commands"/>
+    <w:bookmarkEnd w:id="49"/>
+    <w:bookmarkStart w:id="50" w:name="essential-commands"/>
     <w:p>
       <w:pPr>
         <w:pStyle w:val="Heading2"/>
@@ -6243,8 +6260,8 @@
         </w:pict>
       </w:r>
     </w:p>
-    <w:bookmarkEnd w:id="49"/>
-    <w:bookmarkStart w:id="50" w:name="key-contacts"/>
+    <w:bookmarkEnd w:id="50"/>
+    <w:bookmarkStart w:id="52" w:name="key-contacts"/>
     <w:p>
       <w:pPr>
         <w:pStyle w:val="Heading2"/>
@@ -6256,12 +6273,13 @@
     <w:tbl>
       <w:tblPr>
         <w:tblStyle w:val="Table"/>
-        <w:tblW w:type="auto" w:w="0"/>
+        <w:tblW w:type="pct" w:w="5000"/>
+        <w:tblLayout w:type="fixed"/>
         <w:tblLook w:firstRow="1" w:lastRow="0" w:firstColumn="0" w:lastColumn="0" w:noHBand="0" w:noVBand="0" w:val="0020"/>
       </w:tblPr>
       <w:tblGrid>
-        <w:gridCol w:w="3960"/>
-        <w:gridCol w:w="3960"/>
+        <w:gridCol w:w="3168"/>
+        <w:gridCol w:w="4752"/>
       </w:tblGrid>
       <w:tr>
         <w:trPr>
@@ -6310,62 +6328,121 @@
             </w:pPr>
             <w:r>
               <w:rPr>
+                <w:b/>
+                <w:bCs/>
+              </w:rPr>
+              <w:t xml:space="preserve">Divya Sornaraja</w:t>
+            </w:r>
+            <w:r>
+              <w:t xml:space="preserve"> </w:t>
+            </w:r>
+            <w:r>
+              <w:t xml:space="preserve">· GitHub</w:t>
+            </w:r>
+            <w:r>
+              <w:t xml:space="preserve"> </w:t>
+            </w:r>
+            <w:hyperlink r:id="rId9">
+              <w:r>
+                <w:rPr>
+                  <w:rStyle w:val="Hyperlink"/>
+                </w:rPr>
+                <w:t xml:space="preserve">@dso6060</w:t>
+              </w:r>
+            </w:hyperlink>
+          </w:p>
+        </w:tc>
+      </w:tr>
+      <w:tr>
+        <w:tc>
+          <w:tcPr/>
+          <w:p>
+            <w:pPr>
+              <w:pStyle w:val="Compact"/>
+            </w:pPr>
+            <w:r>
+              <w:t xml:space="preserve">Co-maintainer</w:t>
+            </w:r>
+          </w:p>
+        </w:tc>
+        <w:tc>
+          <w:tcPr/>
+          <w:p>
+            <w:pPr>
+              <w:pStyle w:val="Compact"/>
+            </w:pPr>
+            <w:r>
+              <w:rPr>
+                <w:b/>
+                <w:bCs/>
+              </w:rPr>
+              <w:t xml:space="preserve">Prajna Prayas</w:t>
+            </w:r>
+            <w:r>
+              <w:t xml:space="preserve"> </w:t>
+            </w:r>
+            <w:r>
+              <w:t xml:space="preserve">· GitHub username TBD (add to</w:t>
+            </w:r>
+            <w:r>
+              <w:t xml:space="preserve"> </w:t>
+            </w:r>
+            <w:r>
+              <w:rPr>
+                <w:rStyle w:val="VerbatimChar"/>
+              </w:rPr>
+              <w:t xml:space="preserve">CODEOWNERS</w:t>
+            </w:r>
+            <w:r>
+              <w:t xml:space="preserve"> </w:t>
+            </w:r>
+            <w:r>
+              <w:t xml:space="preserve">when confirmed)</w:t>
+            </w:r>
+          </w:p>
+        </w:tc>
+      </w:tr>
+      <w:tr>
+        <w:tc>
+          <w:tcPr/>
+          <w:p>
+            <w:pPr>
+              <w:pStyle w:val="Compact"/>
+            </w:pPr>
+            <w:r>
+              <w:t xml:space="preserve">Domain reviewers (institutional)</w:t>
+            </w:r>
+          </w:p>
+        </w:tc>
+        <w:tc>
+          <w:tcPr/>
+          <w:p>
+            <w:pPr>
+              <w:pStyle w:val="Compact"/>
+            </w:pPr>
+            <w:hyperlink r:id="rId51">
+              <w:r>
+                <w:rPr>
+                  <w:rStyle w:val="Hyperlink"/>
+                </w:rPr>
+                <w:t xml:space="preserve">TrustBridge Rule of Law Foundation</w:t>
+              </w:r>
+            </w:hyperlink>
+            <w:r>
+              <w:t xml:space="preserve"> </w:t>
+            </w:r>
+            <w:r>
+              <w:t xml:space="preserve">—</w:t>
+            </w:r>
+            <w:r>
+              <w:t xml:space="preserve"> </w:t>
+            </w:r>
+            <w:r>
+              <w:rPr>
                 <w:i/>
                 <w:iCs/>
               </w:rPr>
-              <w:t xml:space="preserve">[founder name — fill in]</w:t>
-            </w:r>
-          </w:p>
-        </w:tc>
-      </w:tr>
-      <w:tr>
-        <w:tc>
-          <w:tcPr/>
-          <w:p>
-            <w:pPr>
-              <w:pStyle w:val="Compact"/>
-            </w:pPr>
-            <w:r>
-              <w:t xml:space="preserve">Co-maintainer</w:t>
-            </w:r>
-          </w:p>
-        </w:tc>
-        <w:tc>
-          <w:tcPr/>
-          <w:p>
-            <w:pPr>
-              <w:pStyle w:val="Compact"/>
-            </w:pPr>
-            <w:r>
-              <w:rPr>
-                <w:i/>
-                <w:iCs/>
-              </w:rPr>
-              <w:t xml:space="preserve">[co-maintainer name — fill in]</w:t>
-            </w:r>
-          </w:p>
-        </w:tc>
-      </w:tr>
-      <w:tr>
-        <w:tc>
-          <w:tcPr/>
-          <w:p>
-            <w:pPr>
-              <w:pStyle w:val="Compact"/>
-            </w:pPr>
-            <w:r>
-              <w:t xml:space="preserve">Domain reviewers</w:t>
-            </w:r>
-          </w:p>
-        </w:tc>
-        <w:tc>
-          <w:tcPr/>
-          <w:p>
-            <w:pPr>
-              <w:pStyle w:val="Compact"/>
-            </w:pPr>
-            <w:r>
-              <w:t xml:space="preserve">TBD</w:t>
+              <w:t xml:space="preserve">partnership / advisory role to be officially confirmed</w:t>
             </w:r>
           </w:p>
         </w:tc>
@@ -6378,8 +6455,8 @@
         </w:pict>
       </w:r>
     </w:p>
-    <w:bookmarkEnd w:id="50"/>
-    <w:bookmarkStart w:id="51" w:name="origin-brief"/>
+    <w:bookmarkEnd w:id="52"/>
+    <w:bookmarkStart w:id="53" w:name="origin-brief"/>
     <w:p>
       <w:pPr>
         <w:pStyle w:val="Heading2"/>
@@ -6492,8 +6569,8 @@
         <w:t xml:space="preserve">from repo root.</w:t>
       </w:r>
     </w:p>
-    <w:bookmarkEnd w:id="51"/>
-    <w:bookmarkEnd w:id="52"/>
+    <w:bookmarkEnd w:id="53"/>
+    <w:bookmarkEnd w:id="54"/>
     <w:sectPr>
       <w:footnotePr>
         <w:numRestart w:val="eachSect"/>

</xml_diff>